<commit_message>
he metido la calidad de abril
</commit_message>
<xml_diff>
--- a/informes/informe_seguimiento_alberto_martinez_2026-04.docx
+++ b/informes/informe_seguimiento_alberto_martinez_2026-04.docx
@@ -207,7 +207,62 @@
     </w:p>
     <w:p>
       <w:r>
-        <w:t>Sin datos registrados</w:t>
+        <w:t>Ayala (51AQ2 AU) — Audi Service</w:t>
+      </w:r>
+    </w:p>
+    <w:p>
+      <w:r>
+        <w:t>Total: 7/8 puntos</w:t>
+      </w:r>
+    </w:p>
+    <w:p>
+      <w:r>
+        <w:rPr>
+          <w:b/>
+          <w:color w:val="1A7A3C"/>
+        </w:rPr>
+        <w:t>Puntos positivos</w:t>
+      </w:r>
+    </w:p>
+    <w:p>
+      <w:pPr>
+        <w:pStyle w:val="ListBullet"/>
+      </w:pPr>
+      <w:r>
+        <w:t>Satisfacción General (CEM Q4): 4,91 — 2/2 pts  |  Referencia: 0pts &lt;4,60 | 1pt ≥4,60 | 2pts ≥4,80</w:t>
+      </w:r>
+    </w:p>
+    <w:p>
+      <w:pPr>
+        <w:pStyle w:val="ListBullet"/>
+      </w:pPr>
+      <w:r>
+        <w:t>Medidas de Servicio (EC28): 0,00% — 2/2 pts  |  Referencia: 0pts &gt;5% | 1pt ≤5% | 2pts ≤1%</w:t>
+      </w:r>
+    </w:p>
+    <w:p>
+      <w:pPr>
+        <w:pStyle w:val="ListBullet"/>
+      </w:pPr>
+      <w:r>
+        <w:t>Conectividad Posventa: 47,30% — 2/2 pts  |  Referencia: 0pts &lt;25% | 1pt ≥25% | 2pts ≥45%</w:t>
+      </w:r>
+    </w:p>
+    <w:p>
+      <w:r>
+        <w:rPr>
+          <w:b/>
+          <w:color w:val="C0392B"/>
+        </w:rPr>
+        <w:t>Puntos a mejorar</w:t>
+      </w:r>
+    </w:p>
+    <w:p>
+      <w:pPr>
+        <w:pStyle w:val="ListBullet"/>
+      </w:pPr>
+      <w:r>
+        <w:t>Información Proceso (TRS): 82,61% — 1/2 pts  |  Referencia: 0pts &lt;80% | 1pt ≥80% | 2pts ≥90%</w:t>
       </w:r>
     </w:p>
     <w:p/>

</xml_diff>